<commit_message>
docs(phase3): complete research paper revision, reviewer response, and empirical validation package
</commit_message>
<xml_diff>
--- a/AI-QTriage_REVISED_CAMERA_READY_ICICNIS.docx
+++ b/AI-QTriage_REVISED_CAMERA_READY_ICICNIS.docx
@@ -11,7 +11,7 @@
         <w:rPr>
           <w:rFonts w:ascii="Times New Roman" w:hAnsi="Times New Roman"/>
           <w:b/>
-          <w:sz w:val="40"/>
+          <w:sz w:val="36"/>
         </w:rPr>
         <w:t>AI-QTriage: A Hybrid AI–Quantum Multimodal Framework for Explainable Injury Assessment and Emergency Support</w:t>
       </w:r>
@@ -80,7 +80,7 @@
         <w:t>AI-QTriage is a hybrid AI–quantum multimodal decision-support framework designed to provide objective preliminary injury risk assessment and coordinated emergency workflow assistance. The architecture integrates three complementary diagnostic modalities: computer vision (YOLO11 for visible lesion localization, EfficientNetV2-S for dermatological pattern classification, and ResNet34-U-Net for pixel-level wound segmentation), a structured patient questionnaire capturing pain intensity and kinetic mechanisms, and continuous 50 Hz smartphone accelerometer telemetry. Extracted features are mapped into a standardized 23-dimensional multimodal representation. Severity classification is executed using a primary classical Extreme Gradient Boosting (XGBoost) model alongside an experimental 4-qubit Variational Quantum Classifier (VQC) simulated via PennyLane's default.qubit engine. Interpretability is enforced via Grad-CAM heatmaps and SHAP Shapley attribution values, accompanied by deterministic kinetic safety thresholds and an emergency SOS protocol.</w:t>
         <w:br/>
         <w:br/>
-        <w:t>Experimental evaluation on held-out test splits demonstrates strong modular software and diagnostic integration: EfficientNetV2-S achieved a macro-F1 score of 94.34% (accuracy 96.62%, N = 473 photos); ResNet34-U-Net achieved a mean Dice similarity coefficient of 64.18% (IoU 51.78%, N = 69 pairs, threshold tau = 0.50); and the sensor classifier achieved 96.34% accuracy (1,183/1,228 windows, SisFall/UCI HAR). On real unconstrained trauma photographs, YOLO11 achieved mAP@50 = 36.47% and mAP@50–95 = 18.44% (Precision = 51.59%, Recall = 39.42%) across 123 photographic wound images (83 train / 17 val / 23 test). On the 23-feature multimodal benchmark, classical XGBoost attained 83.33% accuracy (25/30, 95% CI: [65.3%, 94.4%], Macro-F1 = 0.7850, MCC = 0.7027), outperforming the simulated 4-qubit VQC (53.33%, 16/30, Macro-F1 = 0.4230, MCC = 0.0960). In independent model evaluations, combining questionnaire symptoms with kinetic sensor telemetry reaches 86.67% accuracy (+30.00 percentage points over unimodal sensor and questionnaire baselines at 56.67%), while the full multimodal framework achieves 83.33% accuracy with critical spatial lesion localization. Because the multimodal dataset relies on 200 synthetic feature vectors with rule-derived research labels, AI-QTriage is presented strictly as an academic research prototype rather than a clinically validated medical device.</w:t>
+        <w:t>Experimental evaluation on held-out test splits demonstrates strong modular software and diagnostic integration: EfficientNetV2-S achieved a macro-F1 score of 94.34% (accuracy 96.62%, N = 473 photos); ResNet34-U-Net achieved a mean Dice similarity coefficient of 64.18% (IoU 51.78%, N = 69 pairs, fixed binarization threshold tau = 0.50); and the sensor classifier achieved 96.34% accuracy (1,183/1,228 windows, macro-F1 89.85%, SisFall/UCI HAR). On real unconstrained trauma photographs, the primary production YOLO11 detector achieved mAP@50 = 34.54% and mAP@50–95 = 16.74% (Precision = 44.57%, Recall = 35.88%) on 436 held-out test images from an expanded 2,813-image corpus (1,935 train / 442 val / 436 test), and mAP@50 = 36.47% on a 123-image localized photographic baseline (83 train / 17 val / 23 test). On the 23-feature multimodal benchmark, classical XGBoost attained 83.33% accuracy (25/30, 95% Wilson Score CI: [66.44%, 92.66%], Macro-F1 = 0.7850, MCC = 0.7027), outperforming the simulated 4-qubit VQC (56.67%, 17/30, 95% CI: [39.20%, 72.62%], Macro-F1 = 0.4214, MCC = 0.1275 on the canonical grouped test split, and 53.33%, 16/30 on sequential evaluation). In independent modality ablation evaluations, combining questionnaire symptoms with kinetic sensor telemetry reached 90.00% accuracy (+33.33 percentage points over unimodal baselines at 56.67%), while the full multimodal framework achieved 83.33% accuracy with critical spatial lesion localization and wound area estimation. Because the multimodal dataset relies on 200 synthetic feature vectors with rule-derived research labels, AI-QTriage is presented strictly as an academic research prototype rather than a clinically validated medical device.</w:t>
       </w:r>
     </w:p>
     <w:p>
@@ -129,7 +129,7 @@
         <w:t>To address these diagnostic limitations, AI-QTriage introduces a multi-tier framework combining computer vision, symptom questionnaires, and high-frequency inertial sensor telemetry. The architecture processes inputs through specialized model pipelines, fuses them into a canonical 23-dimensional feature space, and evaluates triage severity using classical gradient boosting while benchmarking a four-qubit variational quantum circuit. Explainability is integrated directly via spatial bounding boxes, pixel segmentation masks, Grad-CAM visual heatmaps, and SHAP feature attribution.</w:t>
         <w:br/>
         <w:br/>
-        <w:t>Crucially, the system is designed strictly as an academic research prototype and does not claim clinical clearance. The multimodal fusion evaluation operates on synthetic research vectors generated under rule-derived research categories. The VQC runs via classical CPU simulation on PennyLane without claiming quantum computational advantage. This paper establishes the feasibility of the end-to-end multimodal architecture, reconciles conflicting baseline metrics, and provides reproducible benchmarks across all subsystems.</w:t>
+        <w:t>Crucially, the system is designed strictly as an academic research prototype and does not claim clinical clearance or autonomous diagnostic authority. The multimodal fusion evaluation operates on synthetic research vectors generated under rule-derived research categories. The VQC runs via classical CPU simulation on PennyLane without claiming quantum computational advantage. This paper establishes the feasibility of the end-to-end multimodal architecture, reconciles conflicting baseline metrics, and provides reproducible benchmarks across all subsystems.</w:t>
       </w:r>
     </w:p>
     <w:p>
@@ -158,7 +158,7 @@
         <w:t>Multimodal biomedical AI has emerged as a promising paradigm for integrating heterogeneous health records, clinical imaging, and physiological signals [1], [2], [7]. In dermatological and wound analysis, deep convolutional architectures such as EfficientNetV2 have demonstrated superior parameter efficiency and high classification accuracy across diverse cutaneous lesions [3], [4]. For localized tissue boundary delineation, encoder-decoder architectures with skip connections such as U-Net [5] remain the gold standard for clinical image segmentation. Explainability in computer vision has been largely driven by gradient-weighted class activation mapping (Grad-CAM) [6], which provides transparent visual localization of decision-critical features.</w:t>
         <w:br/>
         <w:br/>
-        <w:t>In physical trauma analysis, wearable and smartphone-based inertial measurement units (IMUs) have been widely deployed for automated fall detection using established public benchmarks including SisFall [9], the UCI Human Activity Recognition (HAR) dataset [10], and the UP-Fall multimodal framework [11]. For structured tabular classification, XGBoost [8] offers robust gradient-boosted decision tree optimization amenable to Shapley additive explanations (SHAP) [12]. Recent explorations in quantum machine learning have evaluated parameterized quantum circuits and Variational Quantum Classifiers (VQCs) for binary and multiclass medical data [13]. However, systematic evaluations consistently show that current noisy intermediate-scale quantum (NISQ) algorithms simulated on classical hardware do not yet outperform classical ensembles. AI-QTriage builds on these foundations by integrating localized object detection, segmentation, whole-image classification, IMU kinetic modeling, and simulated quantum circuits into an integrated triage workflow.</w:t>
+        <w:t>In physical trauma analysis, wearable and smartphone-based inertial measurement units (IMUs) have been widely deployed for automated fall detection using established public benchmarks including SisFall [9], the UCI Human Activity Recognition (HAR) dataset [10], and the UP-Fall multimodal framework [11]. For structured tabular classification, XGBoost [8] offers robust gradient-boosted decision tree optimization amenable to Shapley additive explanations (SHAP) [12]. Recent explorations in quantum machine learning have evaluated parameterized quantum circuits and Variational Quantum Classifiers (VQCs) for binary and multiclass medical data [13]. However, systematic evaluations consistently demonstrate that current noisy intermediate-scale quantum (NISQ) algorithms simulated on classical hardware do not yet outperform classical ensembles. AI-QTriage builds on these foundations by integrating localized object detection, segmentation, whole-image classification, IMU kinetic modeling, and simulated quantum circuits into an integrated triage workflow.</w:t>
       </w:r>
     </w:p>
     <w:p>
@@ -200,7 +200,7 @@
         </w:rPr>
         <w:t>AI-QTriage utilizes four distinct datasets to train and evaluate its component models:</w:t>
         <w:br/>
-        <w:t>1. Photographic Trauma Detection Dataset: Evaluated on 123 authentic photographic wound images comprising 412 annotated bounding-box instances across cuts, bruises, and open wounds. The dataset is partitioned into 83 training images (288 wound, 12 bruise, 15 cut boxes), 17 validation images (70 wound, 1 bruise, 2 cut boxes), and 23 held-out test images (65 wound, 4 bruise, 5 cut boxes). An auxiliary baseline dataset of 126 synthetic drawings (87 train / 20 val / 19 test) was examined during preliminary training.</w:t>
+        <w:t>1. Photographic Trauma Detection Dataset: The primary production object detector is trained on an expanded corpus of 2,813 photographic wound images (1,935 train / 442 val / 436 held-out test images) spanning cuts, bruises, abrasions, burns, lacerations, and surgical wounds. A localized benchmark dataset of 123 authentic photographic wound images comprising 412 annotated bounding-box instances is partitioned into 83 training images (288 wound, 12 bruise, 15 cut boxes), 17 validation images (70 wound, 1 bruise, 2 cut boxes), and 23 held-out test images (65 wound, 4 bruise, 5 cut boxes). An auxiliary baseline dataset of 126 synthetic drawings (87 train / 20 val / 19 test) was examined during preliminary training.</w:t>
         <w:br/>
         <w:t>2. Photographic Wound Classification Dataset: Sourced from public Kaggle multiclass wound repositories comprising 2,000+ images across 8 categories (abrasion, bruise, burn, cut, laceration, wound, normal skin, and out-of-distribution reject controls). The independent held-out test split consists of 473 photographic images.</w:t>
         <w:br/>
@@ -375,7 +375,7 @@
           <w:i/>
           <w:sz w:val="22"/>
         </w:rPr>
-        <w:t>3.7. Canonical 23-Dimensional Multimodal Feature Vector Schema</w:t>
+        <w:t>3.7. Canonical 23-Dimensional Multimodal Feature Vector Schema and Triage Rules</w:t>
       </w:r>
     </w:p>
     <w:p>
@@ -389,6 +389,21 @@
           <w:sz w:val="20"/>
         </w:rPr>
         <w:t>Extracted features are fused into a canonical vector F = [F_vision, F_questionnaire, F_sensor] in R^23 following the Option-A missingness protocol (when a modality is absent, its presence indicator is 0.0 and its corresponding feature dimensions are represented as explicit zeros). The complete 23-feature breakdown is documented in Table I.</w:t>
+        <w:br/>
+        <w:br/>
+        <w:t>Ground truth triage severity labels on the synthetic research benchmark are assigned through a continuous Severity Index S defined as:</w:t>
+        <w:br/>
+        <w:t>S = 0.40 * F7 + 0.30 * min(F19 / 10.0, 1.0) + 0.30 * F5,</w:t>
+        <w:br/>
+        <w:t>where F7 is normalized pain, F19 is peak kinetic acceleration (normalized by 10g), and F5 is the U-Net affected wound area ratio. Triage categories are established by deterministic cutoffs:</w:t>
+        <w:br/>
+        <w:t>- LOW: S &lt; 0.32</w:t>
+        <w:br/>
+        <w:t>- MODERATE: 0.32 &lt;= S &lt; 0.58</w:t>
+        <w:br/>
+        <w:t>- HIGH: S &gt;= 0.58</w:t>
+        <w:br/>
+        <w:t>Additionally, deterministic clinical red-flag overrides enforce patient safety: cases exhibiting active cutaneous bleeding (F14 = 1.0) with severe kinetic impact (F19 &gt;= 6.0g), or complete weight-bearing inability (F16 = 1.0) paired with acute pain (F7 &gt;= 0.80), are unconditionally escalated to HIGH regardless of index S.</w:t>
       </w:r>
     </w:p>
     <w:tbl>
@@ -2268,10 +2283,10 @@
           <w:rFonts w:ascii="Times New Roman" w:hAnsi="Times New Roman"/>
           <w:sz w:val="20"/>
         </w:rPr>
-        <w:t>Table II summarizes the performance of the classical XGBoost model and the experimental 4-qubit VQC evaluated on the identical held-out test split (N = 30 vectors). Classical XGBoost achieved an accuracy of 83.33% (25/30, 95% Wilson Score CI: [65.3%, 94.4%]), Macro Precision of 0.8222, Macro Recall of 0.7693, Macro-F1 of 0.7850, and Matthews Correlation Coefficient (MCC) of 0.7027. Calibration evaluation yielded a multiclass Brier score of 0.3045 and Expected Calibration Error (ECE) of 0.1183.</w:t>
+        <w:t>Table II summarizes the performance of the classical XGBoost model and the experimental 4-qubit VQC evaluated on the identical held-out test split (N = 30 vectors). Classical XGBoost achieved an accuracy of 83.33% (25/30, 95% Wilson Score CI: [66.44%, 92.66%]), Macro Precision of 0.8222, Macro Recall of 0.7693, Macro-F1 of 0.7850, and Matthews Correlation Coefficient (MCC) of 0.7027. Calibration evaluation yielded a multiclass Brier score of 0.3045 and Expected Calibration Error (ECE) of 0.1183.</w:t>
         <w:br/>
         <w:br/>
-        <w:t>In contrast, the 4-qubit VQC achieved 53.33% accuracy (16/30, 95% CI: [36.1%, 69.8%]), Macro-F1 of 0.4230, and MCC of 0.0960. While VQC demonstrates successful end-to-end quantum circuit integration within a multimodal data pipeline, its near-zero MCC confirms that small simulated quantum circuits currently achieve performance barely above the 33.3% random baseline on complex tabular feature sets. No quantum computational advantage is observed, confirming that classical boosting remains superior.</w:t>
+        <w:t>In contrast, the 4-qubit VQC achieved 56.67% accuracy (17/30, 95% Wilson Score CI: [39.20%, 72.62%], Macro-F1 = 0.4214, MCC = 0.1275) on the canonical grouped test split, and 53.33% accuracy (16/30, Macro-F1 = 0.3606, MCC = 0.0173) under sequential evaluation. While VQC demonstrates successful end-to-end quantum circuit integration within a multimodal data pipeline, its low MCC reflects a strong majority-class bias toward MODERATE (predicting MODERATE in 25 of 30 test cases). No quantum computational advantage is observed on classical simulators, confirming that classical boosting remains vastly superior for tabular triage.</w:t>
       </w:r>
     </w:p>
     <w:tbl>
@@ -2398,7 +2413,7 @@
                 <w:rFonts w:ascii="Times New Roman" w:hAnsi="Times New Roman"/>
                 <w:sz w:val="18"/>
               </w:rPr>
-              <w:t>16 / 30</w:t>
+              <w:t>17 / 30 (Grouped) | 16 / 30 (Sequential)</w:t>
             </w:r>
           </w:p>
         </w:tc>
@@ -2436,7 +2451,7 @@
                 <w:rFonts w:ascii="Times New Roman" w:hAnsi="Times New Roman"/>
                 <w:sz w:val="18"/>
               </w:rPr>
-              <w:t>83.33% (95% CI: [65.3%, 94.4%])</w:t>
+              <w:t>83.33% (95% CI: [66.44%, 92.66%])</w:t>
             </w:r>
           </w:p>
         </w:tc>
@@ -2454,7 +2469,7 @@
                 <w:rFonts w:ascii="Times New Roman" w:hAnsi="Times New Roman"/>
                 <w:sz w:val="18"/>
               </w:rPr>
-              <w:t>53.33% (95% CI: [36.1%, 69.8%])</w:t>
+              <w:t>56.67% (Grouped) | 53.33% (Sequential)</w:t>
             </w:r>
           </w:p>
         </w:tc>
@@ -2492,7 +2507,7 @@
                 <w:rFonts w:ascii="Times New Roman" w:hAnsi="Times New Roman"/>
                 <w:sz w:val="18"/>
               </w:rPr>
-              <w:t>0.822222</w:t>
+              <w:t>0.8222</w:t>
             </w:r>
           </w:p>
         </w:tc>
@@ -2510,7 +2525,7 @@
                 <w:rFonts w:ascii="Times New Roman" w:hAnsi="Times New Roman"/>
                 <w:sz w:val="18"/>
               </w:rPr>
-              <w:t>0.466184</w:t>
+              <w:t>0.3833 (Grouped) | 0.3667 (Sequential)</w:t>
             </w:r>
           </w:p>
         </w:tc>
@@ -2548,7 +2563,7 @@
                 <w:rFonts w:ascii="Times New Roman" w:hAnsi="Times New Roman"/>
                 <w:sz w:val="18"/>
               </w:rPr>
-              <w:t>0.769281</w:t>
+              <w:t>0.7693</w:t>
             </w:r>
           </w:p>
         </w:tc>
@@ -2566,7 +2581,7 @@
                 <w:rFonts w:ascii="Times New Roman" w:hAnsi="Times New Roman"/>
                 <w:sz w:val="18"/>
               </w:rPr>
-              <w:t>0.432680</w:t>
+              <w:t>0.4706 (Grouped) | 0.3556 (Sequential)</w:t>
             </w:r>
           </w:p>
         </w:tc>
@@ -2604,7 +2619,7 @@
                 <w:rFonts w:ascii="Times New Roman" w:hAnsi="Times New Roman"/>
                 <w:sz w:val="18"/>
               </w:rPr>
-              <w:t>0.785020</w:t>
+              <w:t>0.7850</w:t>
             </w:r>
           </w:p>
         </w:tc>
@@ -2622,7 +2637,7 @@
                 <w:rFonts w:ascii="Times New Roman" w:hAnsi="Times New Roman"/>
                 <w:sz w:val="18"/>
               </w:rPr>
-              <w:t>0.423016</w:t>
+              <w:t>0.4214 (Grouped) | 0.3606 (Sequential)</w:t>
             </w:r>
           </w:p>
         </w:tc>
@@ -2660,7 +2675,7 @@
                 <w:rFonts w:ascii="Times New Roman" w:hAnsi="Times New Roman"/>
                 <w:sz w:val="18"/>
               </w:rPr>
-              <w:t>0.702692</w:t>
+              <w:t>0.7027</w:t>
             </w:r>
           </w:p>
         </w:tc>
@@ -2678,7 +2693,7 @@
                 <w:rFonts w:ascii="Times New Roman" w:hAnsi="Times New Roman"/>
                 <w:sz w:val="18"/>
               </w:rPr>
-              <w:t>0.095978</w:t>
+              <w:t>0.1275 (Grouped) | 0.0173 (Sequential)</w:t>
             </w:r>
           </w:p>
         </w:tc>
@@ -2716,7 +2731,7 @@
                 <w:rFonts w:ascii="Times New Roman" w:hAnsi="Times New Roman"/>
                 <w:sz w:val="18"/>
               </w:rPr>
-              <w:t>0.304532</w:t>
+              <w:t>0.3045</w:t>
             </w:r>
           </w:p>
         </w:tc>
@@ -2734,7 +2749,7 @@
                 <w:rFonts w:ascii="Times New Roman" w:hAnsi="Times New Roman"/>
                 <w:sz w:val="18"/>
               </w:rPr>
-              <w:t>0.512306</w:t>
+              <w:t>0.5123</w:t>
             </w:r>
           </w:p>
         </w:tc>
@@ -2772,7 +2787,7 @@
                 <w:rFonts w:ascii="Times New Roman" w:hAnsi="Times New Roman"/>
                 <w:sz w:val="18"/>
               </w:rPr>
-              <w:t>0.118284</w:t>
+              <w:t>0.1183</w:t>
             </w:r>
           </w:p>
         </w:tc>
@@ -2790,7 +2805,7 @@
                 <w:rFonts w:ascii="Times New Roman" w:hAnsi="Times New Roman"/>
                 <w:sz w:val="18"/>
               </w:rPr>
-              <w:t>0.136455</w:t>
+              <w:t>0.1365</w:t>
             </w:r>
           </w:p>
         </w:tc>
@@ -2944,7 +2959,7 @@
           <w:rFonts w:ascii="Times New Roman" w:hAnsi="Times New Roman"/>
           <w:sz w:val="20"/>
         </w:rPr>
-        <w:t>To rigorously evaluate the individual and synergistic contributions of each input modality, an independent-model ablation experiment was executed on the untouched held-out test split (N = 30) alongside runtime zero-masking missingness baselines. As reported in Table III, models trained independently on unimodal subsets exhibit constrained discriminative capacity: Vision Only achieves 33.33% accuracy (MCC = -0.1632), Questionnaire Only achieves 56.67% accuracy (MCC = 0.2343), and Sensor Only achieves 56.67% accuracy (MCC = 0.3743). In contrast, combining Questionnaire symptoms with physical Sensor telemetry yields dominant classification performance: 86.67% accuracy (26/30), 0.8148 Macro-F1, and 0.7609 MCC. The Full Multimodal architecture (F0–F22) achieves 83.33% accuracy (25/30), 0.7850 Macro-F1, and 0.7027 MCC. While Questionnaire and Sensor data drive discrete tabular severity classification, Vision is critical to the clinical system by providing spatial lesion localization (YOLO11 36.47% mAP50) and wound surface area quantification (U-Net 64.18% Dice) for clinician review.</w:t>
+        <w:t>To rigorously evaluate the individual and synergistic contributions of each input modality, a 7-configuration ablation experiment was executed on the untouched held-out test split (N = 30) using independently trained models for each active feature subset. As documented in Table III, unimodal classifiers exhibit constrained performance: Vision Only achieves 40.00% accuracy (MCC = -0.0610), Questionnaire Only achieves 56.67% accuracy (MCC = 0.3340), and Sensor Only achieves 56.67% accuracy (MCC = 0.3325). In contrast, combining Questionnaire symptoms with physical Sensor telemetry yields dominant classification performance: 90.00% accuracy (27/30), 0.8693 Macro-F1, and 0.8251 MCC. The Full Multimodal architecture (F0–F22) achieves 83.33% accuracy (25/30), 0.7850 Macro-F1, and 0.7027 MCC. While Questionnaire and Sensor data drive discrete tabular severity classification, Vision is critical to the clinical system by providing spatial lesion localization (YOLO11 34.54% mAP50 on 436 test photos) and wound surface area quantification (U-Net 64.18% Dice) for clinician review.</w:t>
       </w:r>
     </w:p>
     <w:tbl>
@@ -3018,7 +3033,7 @@
                 <w:b/>
                 <w:sz w:val="18"/>
               </w:rPr>
-              <w:t>Independent Acc (%)</w:t>
+              <w:t>Test Accuracy (%)</w:t>
             </w:r>
           </w:p>
         </w:tc>
@@ -3038,7 +3053,7 @@
                 <w:b/>
                 <w:sz w:val="18"/>
               </w:rPr>
-              <w:t>Independent F1</w:t>
+              <w:t>Macro F1</w:t>
             </w:r>
           </w:p>
         </w:tc>
@@ -3058,7 +3073,7 @@
                 <w:b/>
                 <w:sz w:val="18"/>
               </w:rPr>
-              <w:t>Independent MCC</w:t>
+              <w:t>MCC</w:t>
             </w:r>
           </w:p>
         </w:tc>
@@ -3078,7 +3093,7 @@
                 <w:b/>
                 <w:sz w:val="18"/>
               </w:rPr>
-              <w:t>Zero-Mask Acc</w:t>
+              <w:t>Wilson 95% CI</w:t>
             </w:r>
           </w:p>
         </w:tc>
@@ -3134,7 +3149,7 @@
                 <w:rFonts w:ascii="Times New Roman" w:hAnsi="Times New Roman"/>
                 <w:sz w:val="18"/>
               </w:rPr>
-              <w:t>33.33% (10/30)</w:t>
+              <w:t>40.00% (12/30)</w:t>
             </w:r>
           </w:p>
         </w:tc>
@@ -3152,7 +3167,7 @@
                 <w:rFonts w:ascii="Times New Roman" w:hAnsi="Times New Roman"/>
                 <w:sz w:val="18"/>
               </w:rPr>
-              <w:t>0.2414</w:t>
+              <w:t>0.2886</w:t>
             </w:r>
           </w:p>
         </w:tc>
@@ -3170,7 +3185,7 @@
                 <w:rFonts w:ascii="Times New Roman" w:hAnsi="Times New Roman"/>
                 <w:sz w:val="18"/>
               </w:rPr>
-              <w:t>-0.1632</w:t>
+              <w:t>-0.0610</w:t>
             </w:r>
           </w:p>
         </w:tc>
@@ -3188,7 +3203,7 @@
                 <w:rFonts w:ascii="Times New Roman" w:hAnsi="Times New Roman"/>
                 <w:sz w:val="18"/>
               </w:rPr>
-              <w:t>46.67%</w:t>
+              <w:t>[24.59%, 57.68%]</w:t>
             </w:r>
           </w:p>
         </w:tc>
@@ -3280,7 +3295,7 @@
                 <w:rFonts w:ascii="Times New Roman" w:hAnsi="Times New Roman"/>
                 <w:sz w:val="18"/>
               </w:rPr>
-              <w:t>+0.2343</w:t>
+              <w:t>+0.3340</w:t>
             </w:r>
           </w:p>
         </w:tc>
@@ -3298,7 +3313,7 @@
                 <w:rFonts w:ascii="Times New Roman" w:hAnsi="Times New Roman"/>
                 <w:sz w:val="18"/>
               </w:rPr>
-              <w:t>56.67%</w:t>
+              <w:t>[39.20%, 72.62%]</w:t>
             </w:r>
           </w:p>
         </w:tc>
@@ -3390,7 +3405,7 @@
                 <w:rFonts w:ascii="Times New Roman" w:hAnsi="Times New Roman"/>
                 <w:sz w:val="18"/>
               </w:rPr>
-              <w:t>+0.3743</w:t>
+              <w:t>+0.3325</w:t>
             </w:r>
           </w:p>
         </w:tc>
@@ -3408,7 +3423,7 @@
                 <w:rFonts w:ascii="Times New Roman" w:hAnsi="Times New Roman"/>
                 <w:sz w:val="18"/>
               </w:rPr>
-              <w:t>46.67%</w:t>
+              <w:t>[39.20%, 72.62%]</w:t>
             </w:r>
           </w:p>
         </w:tc>
@@ -3464,7 +3479,7 @@
                 <w:rFonts w:ascii="Times New Roman" w:hAnsi="Times New Roman"/>
                 <w:sz w:val="18"/>
               </w:rPr>
-              <w:t>43.33% (13/30)</w:t>
+              <w:t>53.33% (16/30)</w:t>
             </w:r>
           </w:p>
         </w:tc>
@@ -3482,7 +3497,7 @@
                 <w:rFonts w:ascii="Times New Roman" w:hAnsi="Times New Roman"/>
                 <w:sz w:val="18"/>
               </w:rPr>
-              <w:t>0.3588</w:t>
+              <w:t>0.4732</w:t>
             </w:r>
           </w:p>
         </w:tc>
@@ -3500,7 +3515,7 @@
                 <w:rFonts w:ascii="Times New Roman" w:hAnsi="Times New Roman"/>
                 <w:sz w:val="18"/>
               </w:rPr>
-              <w:t>-0.0464</w:t>
+              <w:t>+0.2647</w:t>
             </w:r>
           </w:p>
         </w:tc>
@@ -3518,7 +3533,7 @@
                 <w:rFonts w:ascii="Times New Roman" w:hAnsi="Times New Roman"/>
                 <w:sz w:val="18"/>
               </w:rPr>
-              <w:t>53.33%</w:t>
+              <w:t>[36.14%, 69.77%]</w:t>
             </w:r>
           </w:p>
         </w:tc>
@@ -3574,7 +3589,7 @@
                 <w:rFonts w:ascii="Times New Roman" w:hAnsi="Times New Roman"/>
                 <w:sz w:val="18"/>
               </w:rPr>
-              <w:t>60.00% (18/30)</w:t>
+              <w:t>63.33% (19/30)</w:t>
             </w:r>
           </w:p>
         </w:tc>
@@ -3592,7 +3607,7 @@
                 <w:rFonts w:ascii="Times New Roman" w:hAnsi="Times New Roman"/>
                 <w:sz w:val="18"/>
               </w:rPr>
-              <w:t>0.5080</w:t>
+              <w:t>0.5321</w:t>
             </w:r>
           </w:p>
         </w:tc>
@@ -3610,7 +3625,7 @@
                 <w:rFonts w:ascii="Times New Roman" w:hAnsi="Times New Roman"/>
                 <w:sz w:val="18"/>
               </w:rPr>
-              <w:t>+0.2968</w:t>
+              <w:t>+0.4079</w:t>
             </w:r>
           </w:p>
         </w:tc>
@@ -3628,7 +3643,7 @@
                 <w:rFonts w:ascii="Times New Roman" w:hAnsi="Times New Roman"/>
                 <w:sz w:val="18"/>
               </w:rPr>
-              <w:t>36.67%</w:t>
+              <w:t>[45.51%, 78.13%]</w:t>
             </w:r>
           </w:p>
         </w:tc>
@@ -3684,7 +3699,7 @@
                 <w:rFonts w:ascii="Times New Roman" w:hAnsi="Times New Roman"/>
                 <w:sz w:val="18"/>
               </w:rPr>
-              <w:t>86.67% (26/30)</w:t>
+              <w:t>90.00% (27/30)</w:t>
             </w:r>
           </w:p>
         </w:tc>
@@ -3702,7 +3717,7 @@
                 <w:rFonts w:ascii="Times New Roman" w:hAnsi="Times New Roman"/>
                 <w:sz w:val="18"/>
               </w:rPr>
-              <w:t>0.8148</w:t>
+              <w:t>0.8693</w:t>
             </w:r>
           </w:p>
         </w:tc>
@@ -3720,7 +3735,7 @@
                 <w:rFonts w:ascii="Times New Roman" w:hAnsi="Times New Roman"/>
                 <w:sz w:val="18"/>
               </w:rPr>
-              <w:t>+0.7609</w:t>
+              <w:t>+0.8251</w:t>
             </w:r>
           </w:p>
         </w:tc>
@@ -3738,7 +3753,7 @@
                 <w:rFonts w:ascii="Times New Roman" w:hAnsi="Times New Roman"/>
                 <w:sz w:val="18"/>
               </w:rPr>
-              <w:t>83.33%</w:t>
+              <w:t>[74.38%, 96.54%]</w:t>
             </w:r>
           </w:p>
         </w:tc>
@@ -3848,7 +3863,7 @@
                 <w:rFonts w:ascii="Times New Roman" w:hAnsi="Times New Roman"/>
                 <w:sz w:val="18"/>
               </w:rPr>
-              <w:t>83.33%</w:t>
+              <w:t>[66.44%, 92.66%]</w:t>
             </w:r>
           </w:p>
         </w:tc>
@@ -3863,7 +3878,7 @@
           <w:b/>
           <w:sz w:val="18"/>
         </w:rPr>
-        <w:t>TABLE III: MODALITY CONTRIBUTION ABLATION: INDEPENDENT MODELS VS. ZERO-MASK RUNTIME BASELINE (TEST N=30)</w:t>
+        <w:t>TABLE III: MODALITY CONTRIBUTION ABLATION: INDEPENDENT MODELS EVALUATED ON HELD-OUT TEST SPLIT (N=30)</w:t>
       </w:r>
     </w:p>
     <w:p>
@@ -4508,11 +4523,11 @@
         </w:rPr>
         <w:t>Vision model evaluation yielded distinct, task-specific findings:</w:t>
         <w:br/>
-        <w:t>1. YOLO11 Detection: On the held-out test split of 23 photographic wound images (74 bounding boxes), YOLO11 achieved mAP@50 = 36.47% and mAP@50–95 = 18.44% (Precision = 51.59%, Recall = 39.42%). Performance was highest for Abrasion (AP50 = 61.03%), Bruise (60.08%), and Cut (50.67%), while deeper chronic Wounds (19.36%) and Burns (16.07%) suffered from texture ambiguity. These results highlight the inherent challenges of unconstrained clinical photography.</w:t>
+        <w:t>1. YOLO11 Detection: On the primary production evaluation comprising 436 held-out test images from the expanded 2,813-image corpus, YOLO11 achieved mAP@50 = 34.54% and mAP@50–95 = 16.74% (Precision = 44.57%, Recall = 35.88%). On the localized 123-image photographic benchmark (23 test images, 74 bounding boxes), YOLO11 achieved mAP@50 = 36.47% and mAP@50–95 = 18.44% (Precision = 51.59%, Recall = 39.42%). Class-wise performance demonstrated highest accuracy for Abrasion (AP50 = 61.03%), Bruise (60.08%), and Cut (50.67%), while deeper chronic Wounds (19.36%) and Burns (16.07%) suffered from skin texture ambiguity. Laceration AP50 was bounded by extreme class sparsity (122 laceration samples vs. 1,999 wounds). These metrics illustrate that YOLO11 serves as an initial spatial Region-of-Interest (ROI) filter rather than an autonomous diagnostic classifier.</w:t>
         <w:br/>
         <w:t>2. EfficientNetV2-S Classification: Evaluated across 473 held-out test photos, the model achieved an overall accuracy of 96.62% and Macro-F1 of 94.34% (Macro Precision: 94.26%, Macro Recall: 95.01%), successfully classifying cuts (F1 = 94.12%), bruises (93.33%), and wounds (98.48%) while maintaining zero out-of-distribution false positives.</w:t>
         <w:br/>
-        <w:t>3. ResNet34-U-Net Segmentation: Across 69 held-out photographic wound-mask pairs, ResNet34-U-Net achieved a Mean Dice score of 64.18% and Mean IoU of 51.78% (Pixel Precision = 69.30%, Pixel Recall = 72.33%, binarization threshold tau = 0.50). This performance is fully consistent with published biomedical literature on non-standardized chronic wound photography, where baseline Dice scores typically range between 62% and 72% due to indistinct epithelial margins.</w:t>
+        <w:t>3. ResNet34-U-Net Segmentation: Across 69 held-out photographic wound-mask pairs, ResNet34-U-Net achieved a Mean Dice score of 64.18% and Mean IoU of 51.78% (Pixel Precision = 69.30%, Pixel Recall = 72.33%, fixed binarization threshold tau = 0.50). This performance aligns with published biomedical literature on non-standardized chronic wound photography, where baseline Dice scores typically range between 62% and 72% due to indistinct epithelial margins and variable illumination.</w:t>
       </w:r>
     </w:p>
     <w:p>
@@ -4538,10 +4553,10 @@
           <w:rFonts w:ascii="Times New Roman" w:hAnsi="Times New Roman"/>
           <w:sz w:val="20"/>
         </w:rPr>
-        <w:t>AI-QTriage demonstrates a functional, multi-tier multimodal framework that successfully integrates computer vision, high-frequency kinetic telemetry, and symptom questionnaires into an explainable preliminary injury assessment pipeline. Rigorous empirical verification resolved prior manuscript contradictions, standardized real photographic detection metrics (YOLO11 mAP@50 = 36.47%), established a 7-configuration modality ablation showing that multimodal fusion achieves 83.33% accuracy (+26.66% to +36.66% over single modalities), and verified sensor classification at 96.34% accuracy on 1,228 real-world IMU windows.</w:t>
+        <w:t>AI-QTriage demonstrates a functional, multi-tier multimodal framework that successfully integrates computer vision, high-frequency kinetic telemetry, and symptom questionnaires into an explainable preliminary injury assessment pipeline. Rigorous empirical verification resolved prior manuscript contradictions, standardized real photographic detection metrics (YOLO11 mAP@50 = 34.54% on 436 test images; 36.47% on localized 23-test split), established a 7-configuration modality ablation showing that multimodal fusion achieves 83.33% accuracy (+26.66% to +43.33% over single vision and sensor modalities), and verified sensor classification at 96.34% accuracy on 1,228 real-world IMU windows.</w:t>
         <w:br/>
         <w:br/>
-        <w:t>The study also confirms that classical gradient-boosted trees (XGBoost accuracy 83.33%, MCC = 0.7027) remain vastly superior to small-scale simulated quantum classifiers (4-qubit VQC accuracy 53.33%, MCC = 0.0960), establishing that current parameterized quantum circuits on classical simulators offer no computational advantage for tabular triage.</w:t>
+        <w:t>The study also confirms that classical gradient-boosted trees (XGBoost accuracy 83.33%, MCC = 0.7027) remain vastly superior to small-scale simulated quantum classifiers (4-qubit VQC accuracy 56.67% grouped / 53.33% sequential, MCC = 0.1275 / 0.0173), establishing that current parameterized quantum circuits on classical simulators offer no computational advantage for tabular triage.</w:t>
         <w:br/>
         <w:br/>
         <w:t>Crucial Research Limitations: AI-QTriage is strictly an academic proof-of-concept. The multimodal tabular dataset comprises 200 synthetic vectors evaluated on a small held-out test split (N = 30), and ground truth labels represent rule-derived research heuristics rather than certified clinical diagnoses. Future work will focus on acquiring large-scale, IRB-approved paired clinical trauma cohorts, expanding mobile-edge inference, and evaluating fault-tolerant quantum algorithms on physical QPU hardware.</w:t>

</xml_diff>